<commit_message>
Balance one-page resume typography and vertical spacing
</commit_message>
<xml_diff>
--- a/assets/Sachin_M_Resume.docx
+++ b/assets/Sachin_M_Resume.docx
@@ -98,7 +98,7 @@
     <w:p>
       <w:pPr>
         <w:keepNext/>
-        <w:spacing w:after="60" w:before="100"/>
+        <w:spacing w:after="60" w:before="130"/>
         <w:pBdr>
           <w:bottom w:val="single" w:sz="4" w:color="555555" w:space="1"/>
         </w:pBdr>
@@ -107,7 +107,7 @@
         <w:rPr>
           <w:b/>
           <w:i w:val="0"/>
-          <w:sz w:val="21"/>
+          <w:sz w:val="22"/>
         </w:rPr>
         <w:t>SUMMARY</w:t>
       </w:r>
@@ -120,7 +120,7 @@
         <w:rPr>
           <w:b w:val="0"/>
           <w:i w:val="0"/>
-          <w:sz w:val="20"/>
+          <w:sz w:val="21"/>
         </w:rPr>
         <w:t>Computer Science and Cybersecurity student focused on penetration testing, web and IoT security, and Python automation. Team Lead and Security Engineer for Guardian Sentinel at the SIH 2025 Grand Finale, with hands-on vulnerability assessment and responsible disclosure practice.</w:t>
       </w:r>
@@ -128,7 +128,7 @@
     <w:p>
       <w:pPr>
         <w:keepNext/>
-        <w:spacing w:after="60" w:before="100"/>
+        <w:spacing w:after="60" w:before="130"/>
         <w:pBdr>
           <w:bottom w:val="single" w:sz="4" w:color="555555" w:space="1"/>
         </w:pBdr>
@@ -137,14 +137,14 @@
         <w:rPr>
           <w:b/>
           <w:i w:val="0"/>
-          <w:sz w:val="21"/>
+          <w:sz w:val="22"/>
         </w:rPr>
         <w:t>TECHNICAL SKILLS</w:t>
       </w:r>
     </w:p>
     <w:p>
       <w:pPr>
-        <w:spacing w:after="30"/>
+        <w:spacing w:after="50"/>
       </w:pPr>
       <w:r>
         <w:rPr>
@@ -153,12 +153,12 @@
         <w:t xml:space="preserve">Security: </w:t>
       </w:r>
       <w:r>
-        <w:t>Web application penetration testing, OWASP Top 10, vulnerability assessment, network and IoT security</w:t>
+        <w:t>Web penetration testing, OWASP Top 10, vulnerability assessment, network and IoT security</w:t>
       </w:r>
     </w:p>
     <w:p>
       <w:pPr>
-        <w:spacing w:after="30"/>
+        <w:spacing w:after="50"/>
       </w:pPr>
       <w:r>
         <w:rPr>
@@ -172,7 +172,7 @@
     </w:p>
     <w:p>
       <w:pPr>
-        <w:spacing w:after="30"/>
+        <w:spacing w:after="50"/>
       </w:pPr>
       <w:r>
         <w:rPr>
@@ -186,7 +186,7 @@
     </w:p>
     <w:p>
       <w:pPr>
-        <w:spacing w:after="30"/>
+        <w:spacing w:after="50"/>
       </w:pPr>
       <w:r>
         <w:rPr>
@@ -201,7 +201,7 @@
     <w:p>
       <w:pPr>
         <w:keepNext/>
-        <w:spacing w:after="60" w:before="100"/>
+        <w:spacing w:after="60" w:before="130"/>
         <w:pBdr>
           <w:bottom w:val="single" w:sz="4" w:color="555555" w:space="1"/>
         </w:pBdr>
@@ -210,7 +210,7 @@
         <w:rPr>
           <w:b/>
           <w:i w:val="0"/>
-          <w:sz w:val="21"/>
+          <w:sz w:val="22"/>
         </w:rPr>
         <w:t>PROFESSIONAL EXPERIENCE</w:t>
       </w:r>
@@ -227,19 +227,19 @@
         <w:rPr>
           <w:b w:val="0"/>
           <w:i w:val="0"/>
-          <w:sz w:val="20"/>
+          <w:sz w:val="21"/>
         </w:rPr>
       </w:r>
       <w:r>
         <w:rPr>
           <w:b/>
-          <w:sz w:val="20"/>
+          <w:sz w:val="21"/>
         </w:rPr>
         <w:t>Softsquare</w:t>
       </w:r>
       <w:r>
         <w:rPr>
-          <w:sz w:val="20"/>
+          <w:sz w:val="21"/>
         </w:rPr>
         <w:tab/>
         <w:t>2024</w:t>
@@ -253,7 +253,7 @@
         <w:rPr>
           <w:b w:val="0"/>
           <w:i/>
-          <w:sz w:val="20"/>
+          <w:sz w:val="21"/>
         </w:rPr>
         <w:t>Cybersecurity &amp; Penetration Testing Intern</w:t>
       </w:r>
@@ -262,7 +262,7 @@
       <w:pPr>
         <w:keepNext w:val="0"/>
         <w:keepLines/>
-        <w:spacing w:after="40"/>
+        <w:spacing w:after="60"/>
         <w:ind w:left="220" w:hanging="180"/>
       </w:pPr>
       <w:r>
@@ -273,7 +273,7 @@
       <w:pPr>
         <w:keepNext w:val="0"/>
         <w:keepLines/>
-        <w:spacing w:after="40"/>
+        <w:spacing w:after="60"/>
         <w:ind w:left="220" w:hanging="180"/>
       </w:pPr>
       <w:r>
@@ -283,7 +283,7 @@
     <w:p>
       <w:pPr>
         <w:keepNext/>
-        <w:spacing w:after="60" w:before="100"/>
+        <w:spacing w:after="60" w:before="130"/>
         <w:pBdr>
           <w:bottom w:val="single" w:sz="4" w:color="555555" w:space="1"/>
         </w:pBdr>
@@ -292,7 +292,7 @@
         <w:rPr>
           <w:b/>
           <w:i w:val="0"/>
-          <w:sz w:val="21"/>
+          <w:sz w:val="22"/>
         </w:rPr>
         <w:t>PROJECTS</w:t>
       </w:r>
@@ -300,13 +300,13 @@
     <w:p>
       <w:pPr>
         <w:keepNext/>
-        <w:spacing w:after="20" w:before="60"/>
+        <w:spacing w:after="20" w:before="80"/>
       </w:pPr>
       <w:r>
         <w:rPr>
           <w:b w:val="0"/>
           <w:i w:val="0"/>
-          <w:sz w:val="20"/>
+          <w:sz w:val="21"/>
         </w:rPr>
       </w:r>
       <w:r>
@@ -340,7 +340,7 @@
       <w:pPr>
         <w:keepNext w:val="0"/>
         <w:keepLines/>
-        <w:spacing w:after="40"/>
+        <w:spacing w:after="60"/>
         <w:ind w:left="220" w:hanging="180"/>
       </w:pPr>
       <w:r>
@@ -350,13 +350,13 @@
     <w:p>
       <w:pPr>
         <w:keepNext/>
-        <w:spacing w:after="20" w:before="60"/>
+        <w:spacing w:after="20" w:before="80"/>
       </w:pPr>
       <w:r>
         <w:rPr>
           <w:b w:val="0"/>
           <w:i w:val="0"/>
-          <w:sz w:val="20"/>
+          <w:sz w:val="21"/>
         </w:rPr>
       </w:r>
       <w:r>
@@ -376,7 +376,7 @@
       <w:pPr>
         <w:keepNext w:val="0"/>
         <w:keepLines/>
-        <w:spacing w:after="40"/>
+        <w:spacing w:after="60"/>
         <w:ind w:left="220" w:hanging="180"/>
       </w:pPr>
       <w:r>
@@ -386,13 +386,13 @@
     <w:p>
       <w:pPr>
         <w:keepNext/>
-        <w:spacing w:after="20" w:before="60"/>
+        <w:spacing w:after="20" w:before="80"/>
       </w:pPr>
       <w:r>
         <w:rPr>
           <w:b w:val="0"/>
           <w:i w:val="0"/>
-          <w:sz w:val="20"/>
+          <w:sz w:val="21"/>
         </w:rPr>
       </w:r>
       <w:r>
@@ -412,7 +412,7 @@
       <w:pPr>
         <w:keepNext w:val="0"/>
         <w:keepLines/>
-        <w:spacing w:after="40"/>
+        <w:spacing w:after="60"/>
         <w:ind w:left="220" w:hanging="180"/>
       </w:pPr>
       <w:r>
@@ -422,7 +422,7 @@
     <w:p>
       <w:pPr>
         <w:keepNext/>
-        <w:spacing w:after="60" w:before="100"/>
+        <w:spacing w:after="60" w:before="130"/>
         <w:pBdr>
           <w:bottom w:val="single" w:sz="4" w:color="555555" w:space="1"/>
         </w:pBdr>
@@ -431,7 +431,7 @@
         <w:rPr>
           <w:b/>
           <w:i w:val="0"/>
-          <w:sz w:val="21"/>
+          <w:sz w:val="22"/>
         </w:rPr>
         <w:t>OTHER PROJECTS TO EXPLORE</w:t>
       </w:r>
@@ -444,7 +444,7 @@
         <w:rPr>
           <w:b w:val="0"/>
           <w:i w:val="0"/>
-          <w:sz w:val="20"/>
+          <w:sz w:val="21"/>
         </w:rPr>
       </w:r>
       <w:hyperlink r:id="rId13" w:history="1">
@@ -504,7 +504,7 @@
     <w:p>
       <w:pPr>
         <w:keepNext/>
-        <w:spacing w:after="60" w:before="100"/>
+        <w:spacing w:after="60" w:before="130"/>
         <w:pBdr>
           <w:bottom w:val="single" w:sz="4" w:color="555555" w:space="1"/>
         </w:pBdr>
@@ -513,7 +513,7 @@
         <w:rPr>
           <w:b/>
           <w:i w:val="0"/>
-          <w:sz w:val="21"/>
+          <w:sz w:val="22"/>
         </w:rPr>
         <w:t>EDUCATION</w:t>
       </w:r>
@@ -530,19 +530,19 @@
         <w:rPr>
           <w:b w:val="0"/>
           <w:i w:val="0"/>
-          <w:sz w:val="20"/>
+          <w:sz w:val="21"/>
         </w:rPr>
       </w:r>
       <w:r>
         <w:rPr>
           <w:b/>
-          <w:sz w:val="20"/>
+          <w:sz w:val="21"/>
         </w:rPr>
         <w:t>Rathinam Technical Campus</w:t>
       </w:r>
       <w:r>
         <w:rPr>
-          <w:sz w:val="20"/>
+          <w:sz w:val="21"/>
         </w:rPr>
         <w:tab/>
         <w:t>2024 - 2028</w:t>
@@ -556,7 +556,7 @@
         <w:rPr>
           <w:b w:val="0"/>
           <w:i w:val="0"/>
-          <w:sz w:val="20"/>
+          <w:sz w:val="21"/>
         </w:rPr>
         <w:t>B.E. Computer Science and Cybersecurity | CGPA: 8.5 | Coimbatore, India</w:t>
       </w:r>
@@ -573,19 +573,19 @@
         <w:rPr>
           <w:b w:val="0"/>
           <w:i w:val="0"/>
-          <w:sz w:val="20"/>
+          <w:sz w:val="21"/>
         </w:rPr>
       </w:r>
       <w:r>
         <w:rPr>
           <w:b w:val="0"/>
-          <w:sz w:val="20"/>
+          <w:sz w:val="21"/>
         </w:rPr>
         <w:t>Dawn Matric Hr. Sec. School | HSC: 78%</w:t>
       </w:r>
       <w:r>
         <w:rPr>
-          <w:sz w:val="20"/>
+          <w:sz w:val="21"/>
         </w:rPr>
         <w:tab/>
         <w:t>2023 - 2024</w:t>
@@ -594,7 +594,7 @@
     <w:p>
       <w:pPr>
         <w:keepNext/>
-        <w:spacing w:after="60" w:before="100"/>
+        <w:spacing w:after="60" w:before="130"/>
         <w:pBdr>
           <w:bottom w:val="single" w:sz="4" w:color="555555" w:space="1"/>
         </w:pBdr>
@@ -603,7 +603,7 @@
         <w:rPr>
           <w:b/>
           <w:i w:val="0"/>
-          <w:sz w:val="21"/>
+          <w:sz w:val="22"/>
         </w:rPr>
         <w:t>ACHIEVEMENTS</w:t>
       </w:r>
@@ -612,7 +612,7 @@
       <w:pPr>
         <w:keepNext w:val="0"/>
         <w:keepLines/>
-        <w:spacing w:after="40"/>
+        <w:spacing w:after="60"/>
         <w:ind w:left="220" w:hanging="180"/>
       </w:pPr>
       <w:r>
@@ -623,17 +623,17 @@
       <w:pPr>
         <w:keepNext w:val="0"/>
         <w:keepLines/>
-        <w:spacing w:after="40"/>
+        <w:spacing w:after="60"/>
         <w:ind w:left="220" w:hanging="180"/>
       </w:pPr>
       <w:r>
-        <w:t>•  Participated in the Spribe Games Bug Bounty Program and reached final rounds in hackathons and pitch events.</w:t>
+        <w:t>•  Participated in the Spribe Games Bug Bounty Program; reached hackathon and pitch-event finals.</w:t>
       </w:r>
     </w:p>
     <w:p>
       <w:pPr>
         <w:keepNext/>
-        <w:spacing w:after="60" w:before="100"/>
+        <w:spacing w:after="60" w:before="130"/>
         <w:pBdr>
           <w:bottom w:val="single" w:sz="4" w:color="555555" w:space="1"/>
         </w:pBdr>
@@ -642,7 +642,7 @@
         <w:rPr>
           <w:b/>
           <w:i w:val="0"/>
-          <w:sz w:val="21"/>
+          <w:sz w:val="22"/>
         </w:rPr>
         <w:t>CERTIFICATIONS</w:t>
       </w:r>
@@ -659,19 +659,19 @@
         <w:rPr>
           <w:b w:val="0"/>
           <w:i w:val="0"/>
-          <w:sz w:val="20"/>
+          <w:sz w:val="21"/>
         </w:rPr>
       </w:r>
       <w:r>
         <w:rPr>
           <w:b w:val="0"/>
-          <w:sz w:val="19"/>
+          <w:sz w:val="20"/>
         </w:rPr>
         <w:t>Moreton Bay - Entrepreneurship and Innovation Virtual Program</w:t>
       </w:r>
       <w:r>
         <w:rPr>
-          <w:sz w:val="19"/>
+          <w:sz w:val="20"/>
         </w:rPr>
         <w:tab/>
         <w:t>2025</w:t>
@@ -689,19 +689,19 @@
         <w:rPr>
           <w:b w:val="0"/>
           <w:i w:val="0"/>
-          <w:sz w:val="20"/>
+          <w:sz w:val="21"/>
         </w:rPr>
       </w:r>
       <w:r>
         <w:rPr>
           <w:b w:val="0"/>
-          <w:sz w:val="19"/>
+          <w:sz w:val="20"/>
         </w:rPr>
         <w:t>HackerRank - Problem Solving, C, Python, JavaScript, HTML &amp; CSS</w:t>
       </w:r>
       <w:r>
         <w:rPr>
-          <w:sz w:val="19"/>
+          <w:sz w:val="20"/>
         </w:rPr>
         <w:tab/>
         <w:t>2022 - 2025</w:t>
@@ -719,19 +719,19 @@
         <w:rPr>
           <w:b w:val="0"/>
           <w:i w:val="0"/>
-          <w:sz w:val="20"/>
+          <w:sz w:val="21"/>
         </w:rPr>
       </w:r>
       <w:r>
         <w:rPr>
           <w:b w:val="0"/>
-          <w:sz w:val="19"/>
+          <w:sz w:val="20"/>
         </w:rPr>
         <w:t>GE Aerospace - HR Analytics &amp; HR Systems</w:t>
       </w:r>
       <w:r>
         <w:rPr>
-          <w:sz w:val="19"/>
+          <w:sz w:val="20"/>
         </w:rPr>
         <w:tab/>
         <w:t>2024</w:t>
@@ -749,19 +749,19 @@
         <w:rPr>
           <w:b w:val="0"/>
           <w:i w:val="0"/>
-          <w:sz w:val="20"/>
+          <w:sz w:val="21"/>
         </w:rPr>
       </w:r>
       <w:r>
         <w:rPr>
           <w:b w:val="0"/>
-          <w:sz w:val="19"/>
+          <w:sz w:val="20"/>
         </w:rPr>
         <w:t>Great Learning - HR Database Management System</w:t>
       </w:r>
       <w:r>
         <w:rPr>
-          <w:sz w:val="19"/>
+          <w:sz w:val="20"/>
         </w:rPr>
         <w:tab/>
         <w:t>2024</w:t>
@@ -779,19 +779,19 @@
         <w:rPr>
           <w:b w:val="0"/>
           <w:i w:val="0"/>
-          <w:sz w:val="20"/>
+          <w:sz w:val="21"/>
         </w:rPr>
       </w:r>
       <w:r>
         <w:rPr>
           <w:b w:val="0"/>
-          <w:sz w:val="19"/>
+          <w:sz w:val="20"/>
         </w:rPr>
         <w:t>Great Learning - Human Resources Management</w:t>
       </w:r>
       <w:r>
         <w:rPr>
-          <w:sz w:val="19"/>
+          <w:sz w:val="20"/>
         </w:rPr>
         <w:tab/>
         <w:t>2023</w:t>
@@ -1171,12 +1171,12 @@
     <w:qFormat/>
     <w:rsid w:val="00FC693F"/>
     <w:pPr>
-      <w:spacing w:after="40" w:line="250" w:lineRule="auto"/>
+      <w:spacing w:after="40" w:line="254" w:lineRule="auto"/>
     </w:pPr>
     <w:rPr>
       <w:rFonts w:ascii="Arial" w:hAnsi="Arial"/>
       <w:color w:val="000000"/>
-      <w:sz w:val="20"/>
+      <w:sz w:val="21"/>
     </w:rPr>
   </w:style>
   <w:style w:type="paragraph" w:styleId="Header">

</xml_diff>

<commit_message>
Improve typography of additional project links in resume
</commit_message>
<xml_diff>
--- a/assets/Sachin_M_Resume.docx
+++ b/assets/Sachin_M_Resume.docx
@@ -438,7 +438,7 @@
     </w:p>
     <w:p>
       <w:pPr>
-        <w:spacing w:after="40"/>
+        <w:spacing w:after="60" w:before="40"/>
       </w:pPr>
       <w:r>
         <w:rPr>
@@ -453,7 +453,8 @@
             <w:rFonts w:ascii="Arial" w:hAnsi="Arial"/>
             <w:color w:val="174EA6"/>
             <w:u w:val="single"/>
-            <w:sz w:val="19"/>
+            <w:sz w:val="22"/>
+            <w:b/>
           </w:rPr>
           <w:t>LOGFLUX</w:t>
         </w:r>
@@ -467,7 +468,8 @@
             <w:rFonts w:ascii="Arial" w:hAnsi="Arial"/>
             <w:color w:val="174EA6"/>
             <w:u w:val="single"/>
-            <w:sz w:val="19"/>
+            <w:sz w:val="22"/>
+            <w:b/>
           </w:rPr>
           <w:t>PARALLAX</w:t>
         </w:r>
@@ -481,7 +483,8 @@
             <w:rFonts w:ascii="Arial" w:hAnsi="Arial"/>
             <w:color w:val="174EA6"/>
             <w:u w:val="single"/>
-            <w:sz w:val="19"/>
+            <w:sz w:val="22"/>
+            <w:b/>
           </w:rPr>
           <w:t>PROJECT AXIOM</w:t>
         </w:r>
@@ -495,7 +498,8 @@
             <w:rFonts w:ascii="Arial" w:hAnsi="Arial"/>
             <w:color w:val="174EA6"/>
             <w:u w:val="single"/>
-            <w:sz w:val="19"/>
+            <w:sz w:val="22"/>
+            <w:b/>
           </w:rPr>
           <w:t>Impact</w:t>
         </w:r>

</xml_diff>

<commit_message>
Add NIDAR 2026 drone security achievement to resume
</commit_message>
<xml_diff>
--- a/assets/Sachin_M_Resume.docx
+++ b/assets/Sachin_M_Resume.docx
@@ -620,6 +620,17 @@
         <w:ind w:left="220" w:hanging="180"/>
       </w:pPr>
       <w:r>
+        <w:t>•  NIDAR 2026 Drone Hackathon Grand Finale participant; served as Drone Software Security Engineer.</w:t>
+      </w:r>
+    </w:p>
+    <w:p>
+      <w:pPr>
+        <w:keepNext w:val="0"/>
+        <w:keepLines/>
+        <w:spacing w:after="60"/>
+        <w:ind w:left="220" w:hanging="180"/>
+      </w:pPr>
+      <w:r>
         <w:t>•  SIH 2025 Grand Finale participant for an NTRO problem statement; Team Lead and Security Engineer for Guardian Sentinel.</w:t>
       </w:r>
     </w:p>
@@ -631,7 +642,7 @@
         <w:ind w:left="220" w:hanging="180"/>
       </w:pPr>
       <w:r>
-        <w:t>•  Participated in the Spribe Games Bug Bounty Program; reached hackathon and pitch-event finals.</w:t>
+        <w:t>•  Participated in the Spribe Games Bug Bounty Program.</w:t>
       </w:r>
     </w:p>
     <w:p>

</xml_diff>